<commit_message>
marked lines in template as decorative
</commit_message>
<xml_diff>
--- a/report_generation/template - Copy.docx
+++ b/report_generation/template - Copy.docx
@@ -132,10 +132,12 @@
       </w:r>
     </w:p>
     <w:sectPr>
-      <w:headerReference w:type="default" r:id="rId6"/>
-      <w:footerReference w:type="default" r:id="rId7"/>
-      <w:headerReference w:type="first" r:id="rId8"/>
-      <w:footerReference w:type="first" r:id="rId9"/>
+      <w:headerReference w:type="even" r:id="rId6"/>
+      <w:headerReference w:type="default" r:id="rId7"/>
+      <w:footerReference w:type="even" r:id="rId8"/>
+      <w:footerReference w:type="default" r:id="rId9"/>
+      <w:headerReference w:type="first" r:id="rId10"/>
+      <w:footerReference w:type="first" r:id="rId11"/>
       <w:pgSz w:w="12240" w:h="15840"/>
       <w:pgMar w:top="720" w:right="720" w:bottom="720" w:left="720" w:header="720" w:footer="720" w:gutter="0"/>
       <w:cols w:space="720"/>
@@ -176,6 +178,16 @@
   <w:p>
     <w:pPr>
       <w:pStyle w:val="Footer"/>
+    </w:pPr>
+  </w:p>
+</w:ftr>
+</file>
+
+<file path=word/footer2.xml><?xml version="1.0" encoding="utf-8"?>
+<w:ftr xmlns:wpc="http://schemas.microsoft.com/office/word/2010/wordprocessingCanvas" xmlns:cx="http://schemas.microsoft.com/office/drawing/2014/chartex" xmlns:cx1="http://schemas.microsoft.com/office/drawing/2015/9/8/chartex" xmlns:cx2="http://schemas.microsoft.com/office/drawing/2015/10/21/chartex" xmlns:cx3="http://schemas.microsoft.com/office/drawing/2016/5/9/chartex" xmlns:cx4="http://schemas.microsoft.com/office/drawing/2016/5/10/chartex" xmlns:cx5="http://schemas.microsoft.com/office/drawing/2016/5/11/chartex" xmlns:cx6="http://schemas.microsoft.com/office/drawing/2016/5/12/chartex" xmlns:cx7="http://schemas.microsoft.com/office/drawing/2016/5/13/chartex" xmlns:cx8="http://schemas.microsoft.com/office/drawing/2016/5/14/chartex" xmlns:mc="http://schemas.openxmlformats.org/markup-compatibility/2006" xmlns:aink="http://schemas.microsoft.com/office/drawing/2016/ink" xmlns:am3d="http://schemas.microsoft.com/office/drawing/2017/model3d" xmlns:o="urn:schemas-microsoft-com:office:office" xmlns:oel="http://schemas.microsoft.com/office/2019/extlst" xmlns:r="http://schemas.openxmlformats.org/officeDocument/2006/relationships" xmlns:m="http://schemas.openxmlformats.org/officeDocument/2006/math" xmlns:v="urn:schemas-microsoft-com:vml" xmlns:wp14="http://schemas.microsoft.com/office/word/2010/wordprocessingDrawing" xmlns:wp="http://schemas.openxmlformats.org/drawingml/2006/wordprocessingDrawing" xmlns:w10="urn:schemas-microsoft-com:office:word" xmlns:w="http://schemas.openxmlformats.org/wordprocessingml/2006/main" xmlns:w14="http://schemas.microsoft.com/office/word/2010/wordml" xmlns:w15="http://schemas.microsoft.com/office/word/2012/wordml" xmlns:w16cex="http://schemas.microsoft.com/office/word/2018/wordml/cex" xmlns:w16cid="http://schemas.microsoft.com/office/word/2016/wordml/cid" xmlns:w16="http://schemas.microsoft.com/office/word/2018/wordml" xmlns:w16du="http://schemas.microsoft.com/office/word/2023/wordml/word16du" xmlns:w16sdtdh="http://schemas.microsoft.com/office/word/2020/wordml/sdtdatahash" xmlns:w16sdtfl="http://schemas.microsoft.com/office/word/2024/wordml/sdtformatlock" xmlns:w16se="http://schemas.microsoft.com/office/word/2015/wordml/symex" xmlns:wpg="http://schemas.microsoft.com/office/word/2010/wordprocessingGroup" xmlns:wpi="http://schemas.microsoft.com/office/word/2010/wordprocessingInk" xmlns:wne="http://schemas.microsoft.com/office/word/2006/wordml" xmlns:wps="http://schemas.microsoft.com/office/word/2010/wordprocessingShape" mc:Ignorable="w14 w15 w16se w16cid w16 w16cex w16sdtdh w16sdtfl w16du wp14">
+  <w:p>
+    <w:pPr>
+      <w:pStyle w:val="Footer"/>
       <w:spacing w:before="240"/>
       <w:jc w:val="center"/>
       <w:rPr>
@@ -192,7 +204,7 @@
       <mc:AlternateContent>
         <mc:Choice Requires="wps">
           <w:drawing>
-            <wp:anchor distT="0" distB="0" distL="114300" distR="114300" simplePos="0" relativeHeight="251678720" behindDoc="0" locked="0" layoutInCell="1" allowOverlap="1" wp14:anchorId="6EF06B8B" wp14:editId="2DEDCA30">
+            <wp:anchor distT="0" distB="0" distL="114300" distR="114300" simplePos="0" relativeHeight="251678720" behindDoc="0" locked="0" layoutInCell="1" allowOverlap="1" wp14:anchorId="6EF06B8B" wp14:editId="76659F54">
               <wp:simplePos x="0" y="0"/>
               <wp:positionH relativeFrom="column">
                 <wp:posOffset>-177165</wp:posOffset>
@@ -203,7 +215,13 @@
               <wp:extent cx="7258685" cy="0"/>
               <wp:effectExtent l="0" t="0" r="0" b="0"/>
               <wp:wrapNone/>
-              <wp:docPr id="693447509" name="Straight Connector 1"/>
+              <wp:docPr id="693447509" name="Straight Connector 1">
+                <a:extLst xmlns:a="http://schemas.openxmlformats.org/drawingml/2006/main">
+                  <a:ext uri="{C183D7F6-B498-43B3-948B-1728B52AA6E4}">
+                    <adec:decorative xmlns:adec="http://schemas.microsoft.com/office/drawing/2017/decorative" val="1"/>
+                  </a:ext>
+                </a:extLst>
+              </wp:docPr>
               <wp:cNvGraphicFramePr/>
               <a:graphic xmlns:a="http://schemas.openxmlformats.org/drawingml/2006/main">
                 <a:graphicData uri="http://schemas.microsoft.com/office/word/2010/wordprocessingShape">
@@ -249,7 +267,7 @@
         </mc:Choice>
         <mc:Fallback>
           <w:pict>
-            <v:line w14:anchorId="48ED938C" id="Straight Connector 1" o:spid="_x0000_s1026" style="position:absolute;z-index:251678720;visibility:visible;mso-wrap-style:square;mso-width-percent:0;mso-wrap-distance-left:9pt;mso-wrap-distance-top:0;mso-wrap-distance-right:9pt;mso-wrap-distance-bottom:0;mso-position-horizontal:absolute;mso-position-horizontal-relative:text;mso-position-vertical:absolute;mso-position-vertical-relative:text;mso-width-percent:0;mso-width-relative:margin" from="-13.95pt,6pt" to="557.6pt,6pt" o:gfxdata="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" strokecolor="#156082 [3204]" strokeweight="1pt">
+            <v:line w14:anchorId="2A8E84CC" id="Straight Connector 1" o:spid="_x0000_s1026" alt="&quot;&quot;" style="position:absolute;z-index:251678720;visibility:visible;mso-wrap-style:square;mso-width-percent:0;mso-wrap-distance-left:9pt;mso-wrap-distance-top:0;mso-wrap-distance-right:9pt;mso-wrap-distance-bottom:0;mso-position-horizontal:absolute;mso-position-horizontal-relative:text;mso-position-vertical:absolute;mso-position-vertical-relative:text;mso-width-percent:0;mso-width-relative:margin" from="-13.95pt,6pt" to="557.6pt,6pt" o:gfxdata="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" strokecolor="#156082 [3204]" strokeweight="1pt">
               <v:stroke joinstyle="miter"/>
             </v:line>
           </w:pict>
@@ -334,7 +352,7 @@
 </w:ftr>
 </file>
 
-<file path=word/footer2.xml><?xml version="1.0" encoding="utf-8"?>
+<file path=word/footer3.xml><?xml version="1.0" encoding="utf-8"?>
 <w:ftr xmlns:wpc="http://schemas.microsoft.com/office/word/2010/wordprocessingCanvas" xmlns:cx="http://schemas.microsoft.com/office/drawing/2014/chartex" xmlns:cx1="http://schemas.microsoft.com/office/drawing/2015/9/8/chartex" xmlns:cx2="http://schemas.microsoft.com/office/drawing/2015/10/21/chartex" xmlns:cx3="http://schemas.microsoft.com/office/drawing/2016/5/9/chartex" xmlns:cx4="http://schemas.microsoft.com/office/drawing/2016/5/10/chartex" xmlns:cx5="http://schemas.microsoft.com/office/drawing/2016/5/11/chartex" xmlns:cx6="http://schemas.microsoft.com/office/drawing/2016/5/12/chartex" xmlns:cx7="http://schemas.microsoft.com/office/drawing/2016/5/13/chartex" xmlns:cx8="http://schemas.microsoft.com/office/drawing/2016/5/14/chartex" xmlns:mc="http://schemas.openxmlformats.org/markup-compatibility/2006" xmlns:aink="http://schemas.microsoft.com/office/drawing/2016/ink" xmlns:am3d="http://schemas.microsoft.com/office/drawing/2017/model3d" xmlns:o="urn:schemas-microsoft-com:office:office" xmlns:oel="http://schemas.microsoft.com/office/2019/extlst" xmlns:r="http://schemas.openxmlformats.org/officeDocument/2006/relationships" xmlns:m="http://schemas.openxmlformats.org/officeDocument/2006/math" xmlns:v="urn:schemas-microsoft-com:vml" xmlns:wp14="http://schemas.microsoft.com/office/word/2010/wordprocessingDrawing" xmlns:wp="http://schemas.openxmlformats.org/drawingml/2006/wordprocessingDrawing" xmlns:w10="urn:schemas-microsoft-com:office:word" xmlns:w="http://schemas.openxmlformats.org/wordprocessingml/2006/main" xmlns:w14="http://schemas.microsoft.com/office/word/2010/wordml" xmlns:w15="http://schemas.microsoft.com/office/word/2012/wordml" xmlns:w16cex="http://schemas.microsoft.com/office/word/2018/wordml/cex" xmlns:w16cid="http://schemas.microsoft.com/office/word/2016/wordml/cid" xmlns:w16="http://schemas.microsoft.com/office/word/2018/wordml" xmlns:w16du="http://schemas.microsoft.com/office/word/2023/wordml/word16du" xmlns:w16sdtdh="http://schemas.microsoft.com/office/word/2020/wordml/sdtdatahash" xmlns:w16sdtfl="http://schemas.microsoft.com/office/word/2024/wordml/sdtformatlock" xmlns:w16se="http://schemas.microsoft.com/office/word/2015/wordml/symex" xmlns:wpg="http://schemas.microsoft.com/office/word/2010/wordprocessingGroup" xmlns:wpi="http://schemas.microsoft.com/office/word/2010/wordprocessingInk" xmlns:wne="http://schemas.microsoft.com/office/word/2006/wordml" xmlns:wps="http://schemas.microsoft.com/office/word/2010/wordprocessingShape" mc:Ignorable="w14 w15 w16se w16cid w16 w16cex w16sdtdh w16sdtfl w16du wp14">
   <w:p>
     <w:pPr>
@@ -355,7 +373,7 @@
       <mc:AlternateContent>
         <mc:Choice Requires="wps">
           <w:drawing>
-            <wp:anchor distT="0" distB="0" distL="114300" distR="114300" simplePos="0" relativeHeight="251676672" behindDoc="0" locked="0" layoutInCell="1" allowOverlap="1" wp14:anchorId="341F115E" wp14:editId="045192E1">
+            <wp:anchor distT="0" distB="0" distL="114300" distR="114300" simplePos="0" relativeHeight="251676672" behindDoc="0" locked="0" layoutInCell="1" allowOverlap="1" wp14:anchorId="341F115E" wp14:editId="339E5346">
               <wp:simplePos x="0" y="0"/>
               <wp:positionH relativeFrom="column">
                 <wp:posOffset>-191135</wp:posOffset>
@@ -366,7 +384,13 @@
               <wp:extent cx="7258685" cy="0"/>
               <wp:effectExtent l="0" t="0" r="0" b="0"/>
               <wp:wrapNone/>
-              <wp:docPr id="230143348" name="Straight Connector 1"/>
+              <wp:docPr id="230143348" name="Straight Connector 1">
+                <a:extLst xmlns:a="http://schemas.openxmlformats.org/drawingml/2006/main">
+                  <a:ext uri="{C183D7F6-B498-43B3-948B-1728B52AA6E4}">
+                    <adec:decorative xmlns:adec="http://schemas.microsoft.com/office/drawing/2017/decorative" val="1"/>
+                  </a:ext>
+                </a:extLst>
+              </wp:docPr>
               <wp:cNvGraphicFramePr/>
               <a:graphic xmlns:a="http://schemas.openxmlformats.org/drawingml/2006/main">
                 <a:graphicData uri="http://schemas.microsoft.com/office/word/2010/wordprocessingShape">
@@ -412,7 +436,7 @@
         </mc:Choice>
         <mc:Fallback>
           <w:pict>
-            <v:line w14:anchorId="7E832A62" id="Straight Connector 1" o:spid="_x0000_s1026" style="position:absolute;z-index:251676672;visibility:visible;mso-wrap-style:square;mso-width-percent:0;mso-wrap-distance-left:9pt;mso-wrap-distance-top:0;mso-wrap-distance-right:9pt;mso-wrap-distance-bottom:0;mso-position-horizontal:absolute;mso-position-horizontal-relative:text;mso-position-vertical:absolute;mso-position-vertical-relative:text;mso-width-percent:0;mso-width-relative:margin" from="-15.05pt,.6pt" to="556.5pt,.6pt" o:gfxdata="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" strokecolor="#156082 [3204]" strokeweight="1pt">
+            <v:line w14:anchorId="702D2B5A" id="Straight Connector 1" o:spid="_x0000_s1026" alt="&quot;&quot;" style="position:absolute;z-index:251676672;visibility:visible;mso-wrap-style:square;mso-width-percent:0;mso-wrap-distance-left:9pt;mso-wrap-distance-top:0;mso-wrap-distance-right:9pt;mso-wrap-distance-bottom:0;mso-position-horizontal:absolute;mso-position-horizontal-relative:text;mso-position-vertical:absolute;mso-position-vertical-relative:text;mso-width-percent:0;mso-width-relative:margin" from="-15.05pt,.6pt" to="556.5pt,.6pt" o:gfxdata="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" strokecolor="#156082 [3204]" strokeweight="1pt">
               <v:stroke joinstyle="miter"/>
             </v:line>
           </w:pict>
@@ -527,6 +551,16 @@
   <w:p>
     <w:pPr>
       <w:pStyle w:val="Header"/>
+    </w:pPr>
+  </w:p>
+</w:hdr>
+</file>
+
+<file path=word/header2.xml><?xml version="1.0" encoding="utf-8"?>
+<w:hdr xmlns:wpc="http://schemas.microsoft.com/office/word/2010/wordprocessingCanvas" xmlns:cx="http://schemas.microsoft.com/office/drawing/2014/chartex" xmlns:cx1="http://schemas.microsoft.com/office/drawing/2015/9/8/chartex" xmlns:cx2="http://schemas.microsoft.com/office/drawing/2015/10/21/chartex" xmlns:cx3="http://schemas.microsoft.com/office/drawing/2016/5/9/chartex" xmlns:cx4="http://schemas.microsoft.com/office/drawing/2016/5/10/chartex" xmlns:cx5="http://schemas.microsoft.com/office/drawing/2016/5/11/chartex" xmlns:cx6="http://schemas.microsoft.com/office/drawing/2016/5/12/chartex" xmlns:cx7="http://schemas.microsoft.com/office/drawing/2016/5/13/chartex" xmlns:cx8="http://schemas.microsoft.com/office/drawing/2016/5/14/chartex" xmlns:mc="http://schemas.openxmlformats.org/markup-compatibility/2006" xmlns:aink="http://schemas.microsoft.com/office/drawing/2016/ink" xmlns:am3d="http://schemas.microsoft.com/office/drawing/2017/model3d" xmlns:o="urn:schemas-microsoft-com:office:office" xmlns:oel="http://schemas.microsoft.com/office/2019/extlst" xmlns:r="http://schemas.openxmlformats.org/officeDocument/2006/relationships" xmlns:m="http://schemas.openxmlformats.org/officeDocument/2006/math" xmlns:v="urn:schemas-microsoft-com:vml" xmlns:wp14="http://schemas.microsoft.com/office/word/2010/wordprocessingDrawing" xmlns:wp="http://schemas.openxmlformats.org/drawingml/2006/wordprocessingDrawing" xmlns:w10="urn:schemas-microsoft-com:office:word" xmlns:w="http://schemas.openxmlformats.org/wordprocessingml/2006/main" xmlns:w14="http://schemas.microsoft.com/office/word/2010/wordml" xmlns:w15="http://schemas.microsoft.com/office/word/2012/wordml" xmlns:w16cex="http://schemas.microsoft.com/office/word/2018/wordml/cex" xmlns:w16cid="http://schemas.microsoft.com/office/word/2016/wordml/cid" xmlns:w16="http://schemas.microsoft.com/office/word/2018/wordml" xmlns:w16du="http://schemas.microsoft.com/office/word/2023/wordml/word16du" xmlns:w16sdtdh="http://schemas.microsoft.com/office/word/2020/wordml/sdtdatahash" xmlns:w16sdtfl="http://schemas.microsoft.com/office/word/2024/wordml/sdtformatlock" xmlns:w16se="http://schemas.microsoft.com/office/word/2015/wordml/symex" xmlns:wpg="http://schemas.microsoft.com/office/word/2010/wordprocessingGroup" xmlns:wpi="http://schemas.microsoft.com/office/word/2010/wordprocessingInk" xmlns:wne="http://schemas.microsoft.com/office/word/2006/wordml" xmlns:wps="http://schemas.microsoft.com/office/word/2010/wordprocessingShape" mc:Ignorable="w14 w15 w16se w16cid w16 w16cex w16sdtdh w16sdtfl w16du wp14">
+  <w:p>
+    <w:pPr>
+      <w:pStyle w:val="Header"/>
       <w:tabs>
         <w:tab w:val="clear" w:pos="4680"/>
         <w:tab w:val="clear" w:pos="9360"/>
@@ -568,7 +602,7 @@
       <mc:AlternateContent>
         <mc:Choice Requires="wps">
           <w:drawing>
-            <wp:anchor distT="0" distB="0" distL="114300" distR="114300" simplePos="0" relativeHeight="251664384" behindDoc="0" locked="0" layoutInCell="1" allowOverlap="1" wp14:anchorId="48690EF1" wp14:editId="2C32EC80">
+            <wp:anchor distT="0" distB="0" distL="114300" distR="114300" simplePos="0" relativeHeight="251664384" behindDoc="0" locked="0" layoutInCell="1" allowOverlap="1" wp14:anchorId="48690EF1" wp14:editId="24F56D0F">
               <wp:simplePos x="0" y="0"/>
               <wp:positionH relativeFrom="column">
                 <wp:posOffset>-177282</wp:posOffset>
@@ -579,7 +613,13 @@
               <wp:extent cx="7259217" cy="0"/>
               <wp:effectExtent l="0" t="0" r="0" b="0"/>
               <wp:wrapNone/>
-              <wp:docPr id="1755723922" name="Straight Connector 1"/>
+              <wp:docPr id="1755723922" name="Straight Connector 1">
+                <a:extLst xmlns:a="http://schemas.openxmlformats.org/drawingml/2006/main">
+                  <a:ext uri="{C183D7F6-B498-43B3-948B-1728B52AA6E4}">
+                    <adec:decorative xmlns:adec="http://schemas.microsoft.com/office/drawing/2017/decorative" val="1"/>
+                  </a:ext>
+                </a:extLst>
+              </wp:docPr>
               <wp:cNvGraphicFramePr/>
               <a:graphic xmlns:a="http://schemas.openxmlformats.org/drawingml/2006/main">
                 <a:graphicData uri="http://schemas.microsoft.com/office/word/2010/wordprocessingShape">
@@ -625,7 +665,7 @@
         </mc:Choice>
         <mc:Fallback>
           <w:pict>
-            <v:line w14:anchorId="57BB007B" id="Straight Connector 1" o:spid="_x0000_s1026" style="position:absolute;z-index:251664384;visibility:visible;mso-wrap-style:square;mso-width-percent:0;mso-wrap-distance-left:9pt;mso-wrap-distance-top:0;mso-wrap-distance-right:9pt;mso-wrap-distance-bottom:0;mso-position-horizontal:absolute;mso-position-horizontal-relative:text;mso-position-vertical:absolute;mso-position-vertical-relative:text;mso-width-percent:0;mso-width-relative:margin" from="-13.95pt,13.55pt" to="557.65pt,13.55pt" o:gfxdata="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" strokecolor="#156082 [3204]" strokeweight="1pt">
+            <v:line w14:anchorId="2D836003" id="Straight Connector 1" o:spid="_x0000_s1026" alt="&quot;&quot;" style="position:absolute;z-index:251664384;visibility:visible;mso-wrap-style:square;mso-width-percent:0;mso-wrap-distance-left:9pt;mso-wrap-distance-top:0;mso-wrap-distance-right:9pt;mso-wrap-distance-bottom:0;mso-position-horizontal:absolute;mso-position-horizontal-relative:text;mso-position-vertical:absolute;mso-position-vertical-relative:text;mso-width-percent:0;mso-width-relative:margin" from="-13.95pt,13.55pt" to="557.65pt,13.55pt" o:gfxdata="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" strokecolor="#156082 [3204]" strokeweight="1pt">
               <v:stroke joinstyle="miter"/>
             </v:line>
           </w:pict>
@@ -636,7 +676,7 @@
 </w:hdr>
 </file>
 
-<file path=word/header2.xml><?xml version="1.0" encoding="utf-8"?>
+<file path=word/header3.xml><?xml version="1.0" encoding="utf-8"?>
 <w:hdr xmlns:wpc="http://schemas.microsoft.com/office/word/2010/wordprocessingCanvas" xmlns:cx="http://schemas.microsoft.com/office/drawing/2014/chartex" xmlns:cx1="http://schemas.microsoft.com/office/drawing/2015/9/8/chartex" xmlns:cx2="http://schemas.microsoft.com/office/drawing/2015/10/21/chartex" xmlns:cx3="http://schemas.microsoft.com/office/drawing/2016/5/9/chartex" xmlns:cx4="http://schemas.microsoft.com/office/drawing/2016/5/10/chartex" xmlns:cx5="http://schemas.microsoft.com/office/drawing/2016/5/11/chartex" xmlns:cx6="http://schemas.microsoft.com/office/drawing/2016/5/12/chartex" xmlns:cx7="http://schemas.microsoft.com/office/drawing/2016/5/13/chartex" xmlns:cx8="http://schemas.microsoft.com/office/drawing/2016/5/14/chartex" xmlns:mc="http://schemas.openxmlformats.org/markup-compatibility/2006" xmlns:aink="http://schemas.microsoft.com/office/drawing/2016/ink" xmlns:am3d="http://schemas.microsoft.com/office/drawing/2017/model3d" xmlns:o="urn:schemas-microsoft-com:office:office" xmlns:oel="http://schemas.microsoft.com/office/2019/extlst" xmlns:r="http://schemas.openxmlformats.org/officeDocument/2006/relationships" xmlns:m="http://schemas.openxmlformats.org/officeDocument/2006/math" xmlns:v="urn:schemas-microsoft-com:vml" xmlns:wp14="http://schemas.microsoft.com/office/word/2010/wordprocessingDrawing" xmlns:wp="http://schemas.openxmlformats.org/drawingml/2006/wordprocessingDrawing" xmlns:w10="urn:schemas-microsoft-com:office:word" xmlns:w="http://schemas.openxmlformats.org/wordprocessingml/2006/main" xmlns:w14="http://schemas.microsoft.com/office/word/2010/wordml" xmlns:w15="http://schemas.microsoft.com/office/word/2012/wordml" xmlns:w16cex="http://schemas.microsoft.com/office/word/2018/wordml/cex" xmlns:w16cid="http://schemas.microsoft.com/office/word/2016/wordml/cid" xmlns:w16="http://schemas.microsoft.com/office/word/2018/wordml" xmlns:w16du="http://schemas.microsoft.com/office/word/2023/wordml/word16du" xmlns:w16sdtdh="http://schemas.microsoft.com/office/word/2020/wordml/sdtdatahash" xmlns:w16sdtfl="http://schemas.microsoft.com/office/word/2024/wordml/sdtformatlock" xmlns:w16se="http://schemas.microsoft.com/office/word/2015/wordml/symex" xmlns:wpg="http://schemas.microsoft.com/office/word/2010/wordprocessingGroup" xmlns:wpi="http://schemas.microsoft.com/office/word/2010/wordprocessingInk" xmlns:wne="http://schemas.microsoft.com/office/word/2006/wordml" xmlns:wps="http://schemas.microsoft.com/office/word/2010/wordprocessingShape" mc:Ignorable="w14 w15 w16se w16cid w16 w16cex w16sdtdh w16sdtfl w16du wp14">
   <w:p>
     <w:pPr>

</xml_diff>